<commit_message>
Updated the Template and added Marriage as well
</commit_message>
<xml_diff>
--- a/letter_gen/template/Birth_Certificate_Verification_TEMPLATE.docx
+++ b/letter_gen/template/Birth_Certificate_Verification_TEMPLATE.docx
@@ -34,7 +34,7 @@
                     <pic:cNvPicPr/>
                   </pic:nvPicPr>
                   <pic:blipFill>
-                    <a:blip r:embed="rId4" cstate="print">
+                    <a:blip r:embed="rId6" cstate="print">
                       <a:extLst>
                         <a:ext uri="{28A0092B-C50C-407E-A947-70E740481C1C}">
                           <a14:useLocalDpi xmlns:a14="http://schemas.microsoft.com/office/drawing/2010/main" val="0"/>
@@ -159,7 +159,68 @@
           <w:sz w:val="22"/>
           <w:szCs w:val="22"/>
         </w:rPr>
-        <w:t xml:space="preserve">Ref No: {{ref_no}}                                                                                                                  Date: {{letter_date}}</w:t>
+        <w:t>Ref No: {{</w:t>
+      </w:r>
+      <w:proofErr w:type="spellStart"/>
+      <w:r>
+        <w:rPr>
+          <w:rFonts w:ascii="Calibri" w:hAnsi="Calibri"/>
+          <w:b/>
+          <w:bCs/>
+          <w:color w:val="000000"/>
+          <w:sz w:val="22"/>
+          <w:szCs w:val="22"/>
+        </w:rPr>
+        <w:t>case_id</w:t>
+      </w:r>
+      <w:proofErr w:type="spellEnd"/>
+      <w:proofErr w:type="gramStart"/>
+      <w:r>
+        <w:rPr>
+          <w:rFonts w:ascii="Calibri" w:hAnsi="Calibri"/>
+          <w:b/>
+          <w:bCs/>
+          <w:color w:val="000000"/>
+          <w:sz w:val="22"/>
+          <w:szCs w:val="22"/>
+        </w:rPr>
+        <w:t xml:space="preserve">}}   </w:t>
+      </w:r>
+      <w:proofErr w:type="gramEnd"/>
+      <w:r>
+        <w:rPr>
+          <w:rFonts w:ascii="Calibri" w:hAnsi="Calibri"/>
+          <w:b/>
+          <w:bCs/>
+          <w:color w:val="000000"/>
+          <w:sz w:val="22"/>
+          <w:szCs w:val="22"/>
+        </w:rPr>
+        <w:t xml:space="preserve">                                                                                                               Date: {{</w:t>
+      </w:r>
+      <w:proofErr w:type="spellStart"/>
+      <w:r>
+        <w:rPr>
+          <w:rFonts w:ascii="Calibri" w:hAnsi="Calibri"/>
+          <w:b/>
+          <w:bCs/>
+          <w:color w:val="000000"/>
+          <w:sz w:val="22"/>
+          <w:szCs w:val="22"/>
+        </w:rPr>
+        <w:t>letter_date</w:t>
+      </w:r>
+      <w:proofErr w:type="spellEnd"/>
+      <w:r>
+        <w:rPr>
+          <w:rFonts w:ascii="Calibri" w:hAnsi="Calibri"/>
+          <w:b/>
+          <w:bCs/>
+          <w:color w:val="000000"/>
+          <w:sz w:val="22"/>
+          <w:szCs w:val="22"/>
+        </w:rPr>
+        <w:t>}}</w:t>
       </w:r>
     </w:p>
     <w:p>
@@ -229,7 +290,29 @@
           <w:sz w:val="22"/>
           <w:szCs w:val="22"/>
         </w:rPr>
-        <w:t>{{registration_office}},</w:t>
+        <w:t>{{</w:t>
+      </w:r>
+      <w:proofErr w:type="spellStart"/>
+      <w:r>
+        <w:rPr>
+          <w:rFonts w:ascii="Calibri" w:hAnsi="Calibri"/>
+          <w:b/>
+          <w:bCs/>
+          <w:sz w:val="22"/>
+          <w:szCs w:val="22"/>
+        </w:rPr>
+        <w:t>registration_office</w:t>
+      </w:r>
+      <w:proofErr w:type="spellEnd"/>
+      <w:r>
+        <w:rPr>
+          <w:rFonts w:ascii="Calibri" w:hAnsi="Calibri"/>
+          <w:b/>
+          <w:bCs/>
+          <w:sz w:val="22"/>
+          <w:szCs w:val="22"/>
+        </w:rPr>
+        <w:t>}},</w:t>
       </w:r>
     </w:p>
     <w:p>
@@ -252,7 +335,29 @@
           <w:sz w:val="22"/>
           <w:szCs w:val="22"/>
         </w:rPr>
-        <w:t xml:space="preserve">{{registration_office_address}}</w:t>
+        <w:t>{{</w:t>
+      </w:r>
+      <w:proofErr w:type="spellStart"/>
+      <w:r>
+        <w:rPr>
+          <w:rFonts w:ascii="Calibri" w:hAnsi="Calibri"/>
+          <w:b/>
+          <w:bCs/>
+          <w:sz w:val="22"/>
+          <w:szCs w:val="22"/>
+        </w:rPr>
+        <w:t>registration_office_address</w:t>
+      </w:r>
+      <w:proofErr w:type="spellEnd"/>
+      <w:r>
+        <w:rPr>
+          <w:rFonts w:ascii="Calibri" w:hAnsi="Calibri"/>
+          <w:b/>
+          <w:bCs/>
+          <w:sz w:val="22"/>
+          <w:szCs w:val="22"/>
+        </w:rPr>
+        <w:t>}}</w:t>
       </w:r>
     </w:p>
     <w:bookmarkEnd w:id="1"/>
@@ -620,7 +725,29 @@
                 <w:sz w:val="20"/>
                 <w:szCs w:val="20"/>
               </w:rPr>
-              <w:t>{{child_name}}</w:t>
+              <w:t>{{</w:t>
+            </w:r>
+            <w:proofErr w:type="spellStart"/>
+            <w:r>
+              <w:rPr>
+                <w:rFonts w:ascii="Calibri" w:hAnsi="Calibri"/>
+                <w:b/>
+                <w:color w:val="000000"/>
+                <w:sz w:val="20"/>
+                <w:szCs w:val="20"/>
+              </w:rPr>
+              <w:t>child_name</w:t>
+            </w:r>
+            <w:proofErr w:type="spellEnd"/>
+            <w:r>
+              <w:rPr>
+                <w:rFonts w:ascii="Calibri" w:hAnsi="Calibri"/>
+                <w:b/>
+                <w:color w:val="000000"/>
+                <w:sz w:val="20"/>
+                <w:szCs w:val="20"/>
+              </w:rPr>
+              <w:t>}}</w:t>
             </w:r>
           </w:p>
         </w:tc>
@@ -746,7 +873,27 @@
                 <w:sz w:val="20"/>
                 <w:szCs w:val="20"/>
               </w:rPr>
-              <w:t>{{father_name}}</w:t>
+              <w:t>{{</w:t>
+            </w:r>
+            <w:proofErr w:type="spellStart"/>
+            <w:r>
+              <w:rPr>
+                <w:rFonts w:ascii="Calibri" w:hAnsi="Calibri"/>
+                <w:color w:val="000000"/>
+                <w:sz w:val="20"/>
+                <w:szCs w:val="20"/>
+              </w:rPr>
+              <w:t>father_name</w:t>
+            </w:r>
+            <w:proofErr w:type="spellEnd"/>
+            <w:r>
+              <w:rPr>
+                <w:rFonts w:ascii="Calibri" w:hAnsi="Calibri"/>
+                <w:color w:val="000000"/>
+                <w:sz w:val="20"/>
+                <w:szCs w:val="20"/>
+              </w:rPr>
+              <w:t>}}</w:t>
             </w:r>
           </w:p>
         </w:tc>
@@ -872,7 +1019,27 @@
                 <w:sz w:val="20"/>
                 <w:szCs w:val="20"/>
               </w:rPr>
-              <w:t>{{mother_name}}</w:t>
+              <w:t>{{</w:t>
+            </w:r>
+            <w:proofErr w:type="spellStart"/>
+            <w:r>
+              <w:rPr>
+                <w:rFonts w:ascii="Calibri" w:hAnsi="Calibri"/>
+                <w:color w:val="000000"/>
+                <w:sz w:val="20"/>
+                <w:szCs w:val="20"/>
+              </w:rPr>
+              <w:t>mother_name</w:t>
+            </w:r>
+            <w:proofErr w:type="spellEnd"/>
+            <w:r>
+              <w:rPr>
+                <w:rFonts w:ascii="Calibri" w:hAnsi="Calibri"/>
+                <w:color w:val="000000"/>
+                <w:sz w:val="20"/>
+                <w:szCs w:val="20"/>
+              </w:rPr>
+              <w:t>}}</w:t>
             </w:r>
           </w:p>
         </w:tc>
@@ -998,7 +1165,27 @@
                 <w:sz w:val="20"/>
                 <w:szCs w:val="20"/>
               </w:rPr>
-              <w:t>{{date_of_birth}}</w:t>
+              <w:t>{{</w:t>
+            </w:r>
+            <w:proofErr w:type="spellStart"/>
+            <w:r>
+              <w:rPr>
+                <w:rFonts w:ascii="Calibri" w:hAnsi="Calibri"/>
+                <w:color w:val="000000"/>
+                <w:sz w:val="20"/>
+                <w:szCs w:val="20"/>
+              </w:rPr>
+              <w:t>date_of_birth</w:t>
+            </w:r>
+            <w:proofErr w:type="spellEnd"/>
+            <w:r>
+              <w:rPr>
+                <w:rFonts w:ascii="Calibri" w:hAnsi="Calibri"/>
+                <w:color w:val="000000"/>
+                <w:sz w:val="20"/>
+                <w:szCs w:val="20"/>
+              </w:rPr>
+              <w:t>}}</w:t>
             </w:r>
           </w:p>
         </w:tc>
@@ -1124,7 +1311,27 @@
                 <w:sz w:val="20"/>
                 <w:szCs w:val="20"/>
               </w:rPr>
-              <w:t>{{place_of_birth}}</w:t>
+              <w:t>{{</w:t>
+            </w:r>
+            <w:proofErr w:type="spellStart"/>
+            <w:r>
+              <w:rPr>
+                <w:rFonts w:ascii="Calibri" w:hAnsi="Calibri"/>
+                <w:color w:val="000000"/>
+                <w:sz w:val="20"/>
+                <w:szCs w:val="20"/>
+              </w:rPr>
+              <w:t>place_of_birth</w:t>
+            </w:r>
+            <w:proofErr w:type="spellEnd"/>
+            <w:r>
+              <w:rPr>
+                <w:rFonts w:ascii="Calibri" w:hAnsi="Calibri"/>
+                <w:color w:val="000000"/>
+                <w:sz w:val="20"/>
+                <w:szCs w:val="20"/>
+              </w:rPr>
+              <w:t>}}</w:t>
             </w:r>
           </w:p>
         </w:tc>
@@ -1250,7 +1457,27 @@
                 <w:sz w:val="20"/>
                 <w:szCs w:val="20"/>
               </w:rPr>
-              <w:t>{{registration_number}}</w:t>
+              <w:t>{{</w:t>
+            </w:r>
+            <w:proofErr w:type="spellStart"/>
+            <w:r>
+              <w:rPr>
+                <w:rFonts w:ascii="Calibri" w:hAnsi="Calibri"/>
+                <w:color w:val="000000"/>
+                <w:sz w:val="20"/>
+                <w:szCs w:val="20"/>
+              </w:rPr>
+              <w:t>registration_number</w:t>
+            </w:r>
+            <w:proofErr w:type="spellEnd"/>
+            <w:r>
+              <w:rPr>
+                <w:rFonts w:ascii="Calibri" w:hAnsi="Calibri"/>
+                <w:color w:val="000000"/>
+                <w:sz w:val="20"/>
+                <w:szCs w:val="20"/>
+              </w:rPr>
+              <w:t>}}</w:t>
             </w:r>
           </w:p>
         </w:tc>
@@ -1756,13 +1983,23 @@
           <w:color w:val="000000"/>
         </w:rPr>
       </w:pPr>
+      <w:proofErr w:type="spellStart"/>
       <w:r>
         <w:rPr>
           <w:rFonts w:ascii="Calibri" w:hAnsi="Calibri" w:cs="Arial"/>
           <w:b/>
           <w:color w:val="000000"/>
         </w:rPr>
-        <w:t>Trudicon Consultancy Services Pvt Ltd</w:t>
+        <w:t>Trudicon</w:t>
+      </w:r>
+      <w:proofErr w:type="spellEnd"/>
+      <w:r>
+        <w:rPr>
+          <w:rFonts w:ascii="Calibri" w:hAnsi="Calibri" w:cs="Arial"/>
+          <w:b/>
+          <w:color w:val="000000"/>
+        </w:rPr>
+        <w:t xml:space="preserve"> Consultancy Services Pvt Ltd</w:t>
       </w:r>
     </w:p>
     <w:p>
@@ -1775,7 +2012,7 @@
         <w:rPr>
           <w:rFonts w:asciiTheme="minorHAnsi" w:hAnsiTheme="minorHAnsi" w:cstheme="minorHAnsi"/>
         </w:rPr>
-        <w:t xml:space="preserve">422, 4</w:t>
+        <w:t>422, 4</w:t>
       </w:r>
       <w:r>
         <w:rPr>
@@ -1858,7 +2095,7 @@
     <w:p/>
     <w:p/>
     <w:sectPr>
-      <w:headerReference w:type="default" r:id="rId5"/>
+      <w:headerReference w:type="default" r:id="rId7"/>
       <w:footnotePr>
         <w:pos w:val="beneathText"/>
       </w:footnotePr>
@@ -1869,6 +2106,44 @@
     </w:sectPr>
   </w:body>
 </w:document>
+</file>
+
+<file path=word/endnotes.xml><?xml version="1.0" encoding="utf-8"?>
+<w:endnotes xmlns:wpc="http://schemas.microsoft.com/office/word/2010/wordprocessingCanvas" xmlns:cx="http://schemas.microsoft.com/office/drawing/2014/chartex" xmlns:cx1="http://schemas.microsoft.com/office/drawing/2015/9/8/chartex" xmlns:cx2="http://schemas.microsoft.com/office/drawing/2015/10/21/chartex" xmlns:cx3="http://schemas.microsoft.com/office/drawing/2016/5/9/chartex" xmlns:cx4="http://schemas.microsoft.com/office/drawing/2016/5/10/chartex" xmlns:cx5="http://schemas.microsoft.com/office/drawing/2016/5/11/chartex" xmlns:cx6="http://schemas.microsoft.com/office/drawing/2016/5/12/chartex" xmlns:cx7="http://schemas.microsoft.com/office/drawing/2016/5/13/chartex" xmlns:cx8="http://schemas.microsoft.com/office/drawing/2016/5/14/chartex" xmlns:mc="http://schemas.openxmlformats.org/markup-compatibility/2006" xmlns:aink="http://schemas.microsoft.com/office/drawing/2016/ink" xmlns:am3d="http://schemas.microsoft.com/office/drawing/2017/model3d" xmlns:o="urn:schemas-microsoft-com:office:office" xmlns:oel="http://schemas.microsoft.com/office/2019/extlst" xmlns:r="http://schemas.openxmlformats.org/officeDocument/2006/relationships" xmlns:m="http://schemas.openxmlformats.org/officeDocument/2006/math" xmlns:v="urn:schemas-microsoft-com:vml" xmlns:wp14="http://schemas.microsoft.com/office/word/2010/wordprocessingDrawing" xmlns:wp="http://schemas.openxmlformats.org/drawingml/2006/wordprocessingDrawing" xmlns:w10="urn:schemas-microsoft-com:office:word" xmlns:w="http://schemas.openxmlformats.org/wordprocessingml/2006/main" xmlns:w14="http://schemas.microsoft.com/office/word/2010/wordml" xmlns:w15="http://schemas.microsoft.com/office/word/2012/wordml" xmlns:w16cex="http://schemas.microsoft.com/office/word/2018/wordml/cex" xmlns:w16cid="http://schemas.microsoft.com/office/word/2016/wordml/cid" xmlns:w16="http://schemas.microsoft.com/office/word/2018/wordml" xmlns:w16du="http://schemas.microsoft.com/office/word/2023/wordml/word16du" xmlns:w16sdtdh="http://schemas.microsoft.com/office/word/2020/wordml/sdtdatahash" xmlns:w16sdtfl="http://schemas.microsoft.com/office/word/2024/wordml/sdtformatlock" xmlns:w16se="http://schemas.microsoft.com/office/word/2015/wordml/symex" xmlns:wpg="http://schemas.microsoft.com/office/word/2010/wordprocessingGroup" xmlns:wpi="http://schemas.microsoft.com/office/word/2010/wordprocessingInk" xmlns:wne="http://schemas.microsoft.com/office/word/2006/wordml" xmlns:wps="http://schemas.microsoft.com/office/word/2010/wordprocessingShape" mc:Ignorable="w14 w15 w16se w16cid w16 w16cex w16sdtdh w16sdtfl w16du wp14">
+  <w:endnote w:type="separator" w:id="-1">
+    <w:p>
+      <w:r>
+        <w:separator/>
+      </w:r>
+    </w:p>
+  </w:endnote>
+  <w:endnote w:type="continuationSeparator" w:id="0">
+    <w:p>
+      <w:r>
+        <w:continuationSeparator/>
+      </w:r>
+    </w:p>
+  </w:endnote>
+</w:endnotes>
+</file>
+
+<file path=word/footnotes.xml><?xml version="1.0" encoding="utf-8"?>
+<w:footnotes xmlns:wpc="http://schemas.microsoft.com/office/word/2010/wordprocessingCanvas" xmlns:cx="http://schemas.microsoft.com/office/drawing/2014/chartex" xmlns:cx1="http://schemas.microsoft.com/office/drawing/2015/9/8/chartex" xmlns:cx2="http://schemas.microsoft.com/office/drawing/2015/10/21/chartex" xmlns:cx3="http://schemas.microsoft.com/office/drawing/2016/5/9/chartex" xmlns:cx4="http://schemas.microsoft.com/office/drawing/2016/5/10/chartex" xmlns:cx5="http://schemas.microsoft.com/office/drawing/2016/5/11/chartex" xmlns:cx6="http://schemas.microsoft.com/office/drawing/2016/5/12/chartex" xmlns:cx7="http://schemas.microsoft.com/office/drawing/2016/5/13/chartex" xmlns:cx8="http://schemas.microsoft.com/office/drawing/2016/5/14/chartex" xmlns:mc="http://schemas.openxmlformats.org/markup-compatibility/2006" xmlns:aink="http://schemas.microsoft.com/office/drawing/2016/ink" xmlns:am3d="http://schemas.microsoft.com/office/drawing/2017/model3d" xmlns:o="urn:schemas-microsoft-com:office:office" xmlns:oel="http://schemas.microsoft.com/office/2019/extlst" xmlns:r="http://schemas.openxmlformats.org/officeDocument/2006/relationships" xmlns:m="http://schemas.openxmlformats.org/officeDocument/2006/math" xmlns:v="urn:schemas-microsoft-com:vml" xmlns:wp14="http://schemas.microsoft.com/office/word/2010/wordprocessingDrawing" xmlns:wp="http://schemas.openxmlformats.org/drawingml/2006/wordprocessingDrawing" xmlns:w10="urn:schemas-microsoft-com:office:word" xmlns:w="http://schemas.openxmlformats.org/wordprocessingml/2006/main" xmlns:w14="http://schemas.microsoft.com/office/word/2010/wordml" xmlns:w15="http://schemas.microsoft.com/office/word/2012/wordml" xmlns:w16cex="http://schemas.microsoft.com/office/word/2018/wordml/cex" xmlns:w16cid="http://schemas.microsoft.com/office/word/2016/wordml/cid" xmlns:w16="http://schemas.microsoft.com/office/word/2018/wordml" xmlns:w16du="http://schemas.microsoft.com/office/word/2023/wordml/word16du" xmlns:w16sdtdh="http://schemas.microsoft.com/office/word/2020/wordml/sdtdatahash" xmlns:w16sdtfl="http://schemas.microsoft.com/office/word/2024/wordml/sdtformatlock" xmlns:w16se="http://schemas.microsoft.com/office/word/2015/wordml/symex" xmlns:wpg="http://schemas.microsoft.com/office/word/2010/wordprocessingGroup" xmlns:wpi="http://schemas.microsoft.com/office/word/2010/wordprocessingInk" xmlns:wne="http://schemas.microsoft.com/office/word/2006/wordml" xmlns:wps="http://schemas.microsoft.com/office/word/2010/wordprocessingShape" mc:Ignorable="w14 w15 w16se w16cid w16 w16cex w16sdtdh w16sdtfl w16du wp14">
+  <w:footnote w:type="separator" w:id="-1">
+    <w:p>
+      <w:r>
+        <w:separator/>
+      </w:r>
+    </w:p>
+  </w:footnote>
+  <w:footnote w:type="continuationSeparator" w:id="0">
+    <w:p>
+      <w:r>
+        <w:continuationSeparator/>
+      </w:r>
+    </w:p>
+  </w:footnote>
+</w:footnotes>
 </file>
 
 <file path=word/header1.xml><?xml version="1.0" encoding="utf-8"?>

</xml_diff>